<commit_message>
feat: publish updated CV, tags and project summaries
- Regenerated site with normalized project tags and summaries
- New CV (2 pages): rewritten experience, skills, location, itch.io
- Add create-project, credvault, dqn and piste pages/assets
- Remove stale location-majdi page
</commit_message>
<xml_diff>
--- a/assets/files/Amen_Allah_Ben_Aissa_CV.docx
+++ b/assets/files/Amen_Allah_Ben_Aissa_CV.docx
@@ -9,14 +9,14 @@
       <w:r>
         <w:rPr>
           <w:b/>
-          <w:sz w:val="40"/>
+          <w:sz w:val="36"/>
         </w:rPr>
         <w:t>Amen Allah Ben Aissa</w:t>
       </w:r>
     </w:p>
     <w:p>
       <w:pPr>
-        <w:spacing w:after="200"/>
+        <w:spacing w:after="160"/>
       </w:pPr>
       <w:r>
         <w:rPr>
@@ -24,12 +24,19 @@
           <w:color w:val="444444"/>
           <w:sz w:val="22"/>
         </w:rPr>
-        <w:t>Software Engineer | Games &amp; Systems</w:t>
+        <w:t>Software Engineer | AI, Systems &amp; Games</w:t>
+      </w:r>
+      <w:r>
+        <w:rPr>
+          <w:color w:val="666666"/>
+          <w:sz w:val="20"/>
+        </w:rPr>
+        <w:t xml:space="preserve">  ·  Tunis, Tunisia</w:t>
       </w:r>
     </w:p>
     <w:p>
       <w:pPr>
-        <w:spacing w:before="280" w:after="80"/>
+        <w:spacing w:before="160" w:after="80"/>
         <w:pBdr>
           <w:bottom w:val="single" w:sz="6" w:space="4" w:color="444444"/>
         </w:pBdr>
@@ -45,7 +52,7 @@
     </w:p>
     <w:p>
       <w:pPr>
-        <w:spacing w:after="40"/>
+        <w:spacing w:after="20"/>
       </w:pPr>
       <w:r>
         <w:rPr>
@@ -59,13 +66,25 @@
             <w:rStyle w:val="Hyperlink"/>
             <w:sz w:val="20"/>
           </w:rPr>
-          <w:t>mailto:log.moonn@gmail.com</w:t>
+          <w:t>log.moonn@gmail.com</w:t>
         </w:r>
       </w:hyperlink>
+      <w:r>
+        <w:t xml:space="preserve">  ·  </w:t>
+      </w:r>
+      <w:r>
+        <w:rPr>
+          <w:b/>
+        </w:rPr>
+        <w:t xml:space="preserve">Location: </w:t>
+      </w:r>
+      <w:r>
+        <w:t>Tunis, Tunisia</w:t>
+      </w:r>
     </w:p>
     <w:p>
       <w:pPr>
-        <w:spacing w:after="40"/>
+        <w:spacing w:after="20"/>
       </w:pPr>
       <w:r>
         <w:rPr>
@@ -82,11 +101,9 @@
           <w:t>https://logmoon.github.io/projects.html</w:t>
         </w:r>
       </w:hyperlink>
-    </w:p>
-    <w:p>
-      <w:pPr>
-        <w:spacing w:after="40"/>
-      </w:pPr>
+      <w:r>
+        <w:t xml:space="preserve">  ·  </w:t>
+      </w:r>
       <w:r>
         <w:rPr>
           <w:b/>
@@ -105,15 +122,33 @@
     </w:p>
     <w:p>
       <w:pPr>
-        <w:spacing w:after="40"/>
+        <w:spacing w:after="20"/>
       </w:pPr>
+      <w:r>
+        <w:rPr>
+          <w:b/>
+        </w:rPr>
+        <w:t xml:space="preserve">Itch.io: </w:t>
+      </w:r>
+      <w:hyperlink r:id="rId12">
+        <w:r>
+          <w:rPr>
+            <w:rStyle w:val="Hyperlink"/>
+            <w:sz w:val="20"/>
+          </w:rPr>
+          <w:t>https://logmoon.itch.io/</w:t>
+        </w:r>
+      </w:hyperlink>
+      <w:r>
+        <w:t xml:space="preserve">  ·  </w:t>
+      </w:r>
       <w:r>
         <w:rPr>
           <w:b/>
         </w:rPr>
         <w:t xml:space="preserve">LinkedIn: </w:t>
       </w:r>
-      <w:hyperlink r:id="rId12">
+      <w:hyperlink r:id="rId13">
         <w:r>
           <w:rPr>
             <w:rStyle w:val="Hyperlink"/>
@@ -125,7 +160,7 @@
     </w:p>
     <w:p>
       <w:pPr>
-        <w:spacing w:before="280" w:after="80"/>
+        <w:spacing w:before="160" w:after="80"/>
         <w:pBdr>
           <w:bottom w:val="single" w:sz="6" w:space="4" w:color="444444"/>
         </w:pBdr>
@@ -148,12 +183,12 @@
           <w:b w:val="0"/>
           <w:i w:val="0"/>
         </w:rPr>
-        <w:t>I'm a software engineer and data science student driven by curiosity about how systems work at every level. I build games, tools, and applications while diving deep into the underlying technologies. I'm passionate about solving complex problems across different domains and creating software that delivers real value.</w:t>
+        <w:t>I'm a software engineer and data science student. I build AI-powered tools, games, and the systems underneath them, from a C game engine and a DQN implemented by hand to a shipped encrypted desktop app and apps real people use. I like owning problems end to end and understanding why things work the way they do.</w:t>
       </w:r>
     </w:p>
     <w:p>
       <w:pPr>
-        <w:spacing w:before="280" w:after="80"/>
+        <w:spacing w:before="160" w:after="80"/>
         <w:pBdr>
           <w:bottom w:val="single" w:sz="6" w:space="4" w:color="444444"/>
         </w:pBdr>
@@ -169,7 +204,7 @@
     </w:p>
     <w:p>
       <w:pPr>
-        <w:spacing w:before="120" w:after="20"/>
+        <w:spacing w:before="60" w:after="20"/>
       </w:pPr>
       <w:r>
         <w:rPr>
@@ -192,14 +227,11 @@
     </w:p>
     <w:p>
       <w:pPr>
-        <w:spacing w:after="60"/>
+        <w:pStyle w:val="ListBullet"/>
+        <w:spacing w:after="20"/>
       </w:pPr>
       <w:r>
-        <w:rPr>
-          <w:b w:val="0"/>
-          <w:i w:val="0"/>
-        </w:rPr>
-        <w:t>Developed a comprehensive career management HRMS fullstack application. Gained hands-on experience in enterprise software development, database design, and collaborative development practices. Used ASP.NET for the backend and Angular for the frontend.</w:t>
+        <w:t>Built a career-management module for the HRMaps HRMS during a 3-month internship, using ASP.NET (layered controllers, services, DTOs) and Angular with PrimeNG and Tailwind.</w:t>
       </w:r>
     </w:p>
     <w:p>
@@ -207,7 +239,24 @@
         <w:pStyle w:val="ListBullet"/>
         <w:spacing w:after="20"/>
       </w:pPr>
-      <w:hyperlink r:id="rId13">
+      <w:r>
+        <w:t>Implemented CareerIntelligenceService: turns performance reviews, skills and tenure into promotion-readiness scores, attrition-risk predictions and skill-gap recommendations across HR, manager and employee dashboards.</w:t>
+      </w:r>
+    </w:p>
+    <w:p>
+      <w:pPr>
+        <w:pStyle w:val="ListBullet"/>
+        <w:spacing w:after="20"/>
+      </w:pPr>
+      <w:r>
+        <w:t>Designed a role-aware approval workflow where manager-initiated promotion and transfer requests skip the standard queue and route directly to HR.</w:t>
+      </w:r>
+    </w:p>
+    <w:p>
+      <w:pPr>
+        <w:spacing w:after="40"/>
+      </w:pPr>
+      <w:hyperlink r:id="rId14">
         <w:r>
           <w:rPr>
             <w:rStyle w:val="Hyperlink"/>
@@ -216,13 +265,10 @@
           <w:t>Square-IT</w:t>
         </w:r>
       </w:hyperlink>
-    </w:p>
-    <w:p>
-      <w:pPr>
-        <w:pStyle w:val="ListBullet"/>
-        <w:spacing w:after="20"/>
-      </w:pPr>
-      <w:hyperlink r:id="rId14">
+      <w:r>
+        <w:t xml:space="preserve">  ·  </w:t>
+      </w:r>
+      <w:hyperlink r:id="rId15">
         <w:r>
           <w:rPr>
             <w:rStyle w:val="Hyperlink"/>
@@ -231,13 +277,10 @@
           <w:t>Project Page</w:t>
         </w:r>
       </w:hyperlink>
-    </w:p>
-    <w:p>
-      <w:pPr>
-        <w:pStyle w:val="ListBullet"/>
-        <w:spacing w:after="20"/>
-      </w:pPr>
-      <w:hyperlink r:id="rId15">
+      <w:r>
+        <w:t xml:space="preserve">  ·  </w:t>
+      </w:r>
+      <w:hyperlink r:id="rId16">
         <w:r>
           <w:rPr>
             <w:rStyle w:val="Hyperlink"/>
@@ -249,7 +292,7 @@
     </w:p>
     <w:p>
       <w:pPr>
-        <w:spacing w:before="120" w:after="20"/>
+        <w:spacing w:before="60" w:after="20"/>
       </w:pPr>
       <w:r>
         <w:rPr>
@@ -272,14 +315,11 @@
     </w:p>
     <w:p>
       <w:pPr>
-        <w:spacing w:after="60"/>
+        <w:pStyle w:val="ListBullet"/>
+        <w:spacing w:after="20"/>
       </w:pPr>
       <w:r>
-        <w:rPr>
-          <w:b w:val="0"/>
-          <w:i w:val="0"/>
-        </w:rPr>
-        <w:t>5-star rated on both Upwork and Fiverr, working on independent game projects and client work with a focus on quality, reliability, and clear communication.</w:t>
+        <w:t>Delivered independent game projects and client work on Fiverr and Upwork, holding a 5-star rating across 17 Fiverr reviews.</w:t>
       </w:r>
     </w:p>
     <w:p>
@@ -287,7 +327,15 @@
         <w:pStyle w:val="ListBullet"/>
         <w:spacing w:after="20"/>
       </w:pPr>
-      <w:hyperlink r:id="rId16">
+      <w:r>
+        <w:t>Worked directly with clients from brief to delivered build, handling scoping, implementation and communication.</w:t>
+      </w:r>
+    </w:p>
+    <w:p>
+      <w:pPr>
+        <w:spacing w:after="40"/>
+      </w:pPr>
+      <w:hyperlink r:id="rId17">
         <w:r>
           <w:rPr>
             <w:rStyle w:val="Hyperlink"/>
@@ -296,13 +344,10 @@
           <w:t>Fiverr Profile</w:t>
         </w:r>
       </w:hyperlink>
-    </w:p>
-    <w:p>
-      <w:pPr>
-        <w:pStyle w:val="ListBullet"/>
-        <w:spacing w:after="20"/>
-      </w:pPr>
-      <w:hyperlink r:id="rId17">
+      <w:r>
+        <w:t xml:space="preserve">  ·  </w:t>
+      </w:r>
+      <w:hyperlink r:id="rId18">
         <w:r>
           <w:rPr>
             <w:rStyle w:val="Hyperlink"/>
@@ -314,13 +359,13 @@
     </w:p>
     <w:p>
       <w:pPr>
-        <w:spacing w:before="120" w:after="20"/>
+        <w:spacing w:before="60" w:after="20"/>
       </w:pPr>
       <w:r>
         <w:rPr>
           <w:b/>
         </w:rPr>
-        <w:t>Senior Game Developer</w:t>
+        <w:t>Senior Game Developer at Novel Bomb</w:t>
       </w:r>
     </w:p>
     <w:p>
@@ -337,14 +382,11 @@
     </w:p>
     <w:p>
       <w:pPr>
-        <w:spacing w:after="60"/>
+        <w:pStyle w:val="ListBullet"/>
+        <w:spacing w:after="20"/>
       </w:pPr>
       <w:r>
-        <w:rPr>
-          <w:b w:val="0"/>
-          <w:i w:val="0"/>
-        </w:rPr>
-        <w:t>Worked on game prototypes and a commercial indie title as a solo developer, handling all in-engine responsibilities including programming, tool creation, level design, and gameplay implementation.</w:t>
+        <w:t>Sole in-engine programmer and lead developer on Stock Boy, a commercial 2D action-adventure in Unity, in a 4-person team.</w:t>
       </w:r>
     </w:p>
     <w:p>
@@ -352,7 +394,15 @@
         <w:pStyle w:val="ListBullet"/>
         <w:spacing w:after="20"/>
       </w:pPr>
-      <w:hyperlink r:id="rId18">
+      <w:r>
+        <w:t>Owned all in-engine work: gameplay systems, custom tools, level design and implementation.</w:t>
+      </w:r>
+    </w:p>
+    <w:p>
+      <w:pPr>
+        <w:spacing w:after="40"/>
+      </w:pPr>
+      <w:hyperlink r:id="rId19">
         <w:r>
           <w:rPr>
             <w:rStyle w:val="Hyperlink"/>
@@ -364,57 +414,7 @@
     </w:p>
     <w:p>
       <w:pPr>
-        <w:spacing w:before="120" w:after="20"/>
-      </w:pPr>
-      <w:r>
-        <w:rPr>
-          <w:b/>
-        </w:rPr>
-        <w:t>Recreational Programming</w:t>
-      </w:r>
-    </w:p>
-    <w:p>
-      <w:pPr>
-        <w:spacing w:after="40"/>
-      </w:pPr>
-      <w:r>
-        <w:rPr>
-          <w:i/>
-          <w:color w:val="666666"/>
-        </w:rPr>
-        <w:t>2020 - Death</w:t>
-      </w:r>
-    </w:p>
-    <w:p>
-      <w:pPr>
-        <w:spacing w:after="60"/>
-      </w:pPr>
-      <w:r>
-        <w:rPr>
-          <w:b w:val="0"/>
-          <w:i w:val="0"/>
-        </w:rPr>
-        <w:t>Always creating smaller projects to learn and understand why the technologies we use are designed the way they are, and how they work under the hood.</w:t>
-      </w:r>
-    </w:p>
-    <w:p>
-      <w:pPr>
-        <w:pStyle w:val="ListBullet"/>
-        <w:spacing w:after="20"/>
-      </w:pPr>
-      <w:hyperlink r:id="rId19">
-        <w:r>
-          <w:rPr>
-            <w:rStyle w:val="Hyperlink"/>
-            <w:sz w:val="20"/>
-          </w:rPr>
-          <w:t>Github</w:t>
-        </w:r>
-      </w:hyperlink>
-    </w:p>
-    <w:p>
-      <w:pPr>
-        <w:spacing w:before="280" w:after="80"/>
+        <w:spacing w:before="160" w:after="80"/>
         <w:pBdr>
           <w:bottom w:val="single" w:sz="6" w:space="4" w:color="444444"/>
         </w:pBdr>
@@ -430,7 +430,7 @@
     </w:p>
     <w:p>
       <w:pPr>
-        <w:spacing w:before="120" w:after="20"/>
+        <w:spacing w:before="60" w:after="20"/>
       </w:pPr>
       <w:r>
         <w:rPr>
@@ -460,12 +460,12 @@
           <w:b w:val="0"/>
           <w:i w:val="0"/>
         </w:rPr>
-        <w:t>Currently pursuing an engineering degree in Data Science, focusing on machine learning, statistical analysis, and software engineering.</w:t>
+        <w:t>Final-year Data Science engineering student focused on machine learning, statistical analysis and software engineering. Currently working on my end-of-studies project (PFE).</w:t>
       </w:r>
     </w:p>
     <w:p>
       <w:pPr>
-        <w:spacing w:before="120" w:after="20"/>
+        <w:spacing w:before="60" w:after="20"/>
       </w:pPr>
       <w:r>
         <w:rPr>
@@ -495,12 +495,12 @@
           <w:b w:val="0"/>
           <w:i w:val="0"/>
         </w:rPr>
-        <w:t>Completed a multidisciplinary preparatory program with a strong foundation in mathematics, physics, and computer science, preparing for competitive engineering schools.</w:t>
+        <w:t>Multidisciplinary preparatory program in mathematics, physics and computer science, preparing for competitive engineering schools.</w:t>
       </w:r>
     </w:p>
     <w:p>
       <w:pPr>
-        <w:spacing w:before="280" w:after="80"/>
+        <w:spacing w:before="160" w:after="80"/>
         <w:pBdr>
           <w:bottom w:val="single" w:sz="6" w:space="4" w:color="444444"/>
         </w:pBdr>
@@ -516,7 +516,7 @@
     </w:p>
     <w:p>
       <w:pPr>
-        <w:spacing w:before="120" w:after="20"/>
+        <w:spacing w:before="60" w:after="20"/>
       </w:pPr>
       <w:hyperlink r:id="rId20">
         <w:r>
@@ -524,28 +524,99 @@
             <w:rStyle w:val="Hyperlink"/>
             <w:sz w:val="20"/>
           </w:rPr>
-          <w:t>CORM</w:t>
+          <w:t>CredVault</w:t>
         </w:r>
       </w:hyperlink>
     </w:p>
     <w:p>
       <w:pPr>
-        <w:spacing w:after="40"/>
+        <w:spacing w:after="20"/>
+      </w:pPr>
+      <w:r>
+        <w:rPr>
+          <w:b w:val="0"/>
+          <w:i w:val="0"/>
+        </w:rPr>
+        <w:t>Local-first, zero-knowledge credential manager shipped as a Rust and Tauri desktop app: Argon2id and AES-256-GCM, one encrypted file, no network calls, installers for Linux and Windows via CI/CD.</w:t>
+      </w:r>
+    </w:p>
+    <w:p>
+      <w:pPr>
+        <w:spacing w:after="20"/>
       </w:pPr>
       <w:r>
         <w:rPr>
           <w:i/>
           <w:color w:val="666666"/>
         </w:rPr>
-        <w:t>C, ORM, SQL, Library</w:t>
+        <w:t>Rust, Tauri, Encryption, Desktop Application, CI/CD, React</w:t>
+      </w:r>
+      <w:r>
+        <w:t xml:space="preserve">  ·  </w:t>
+      </w:r>
+      <w:hyperlink r:id="rId21">
+        <w:r>
+          <w:rPr>
+            <w:rStyle w:val="Hyperlink"/>
+            <w:sz w:val="20"/>
+          </w:rPr>
+          <w:t>Github (Source Code)</w:t>
+        </w:r>
+      </w:hyperlink>
+      <w:r>
+        <w:t xml:space="preserve">  ·  </w:t>
+      </w:r>
+      <w:hyperlink r:id="rId22">
+        <w:r>
+          <w:rPr>
+            <w:rStyle w:val="Hyperlink"/>
+            <w:sz w:val="20"/>
+          </w:rPr>
+          <w:t>Github Releases (Download)</w:t>
+        </w:r>
+      </w:hyperlink>
+    </w:p>
+    <w:p>
+      <w:pPr>
+        <w:spacing w:before="60" w:after="20"/>
+      </w:pPr>
+      <w:hyperlink r:id="rId23">
+        <w:r>
+          <w:rPr>
+            <w:rStyle w:val="Hyperlink"/>
+            <w:sz w:val="20"/>
+          </w:rPr>
+          <w:t>Rental Property Manager</w:t>
+        </w:r>
+      </w:hyperlink>
+    </w:p>
+    <w:p>
+      <w:pPr>
+        <w:spacing w:after="20"/>
+      </w:pPr>
+      <w:r>
+        <w:rPr>
+          <w:b w:val="0"/>
+          <w:i w:val="0"/>
+        </w:rPr>
+        <w:t>React Native and Supabase app used by 10 family members and agents to manage rental houses and bookings, with offline access, JWT auth, push notifications and an EAS CI/CD pipeline shipping over-the-air updates.</w:t>
       </w:r>
     </w:p>
     <w:p>
       <w:pPr>
-        <w:pStyle w:val="ListBullet"/>
         <w:spacing w:after="20"/>
       </w:pPr>
-      <w:hyperlink r:id="rId21">
+      <w:r>
+        <w:rPr>
+          <w:i/>
+          <w:color w:val="666666"/>
+        </w:rPr>
+        <w:t>React Native, TypeScript, Supabase, CI/CD, Mobile</w:t>
+      </w:r>
+      <w:r>
+        <w:t xml:space="preserve">  ·  </w:t>
+      </w:r>
+      <w:hyperlink r:id="rId24">
         <w:r>
           <w:rPr>
             <w:rStyle w:val="Hyperlink"/>
@@ -557,50 +628,9 @@
     </w:p>
     <w:p>
       <w:pPr>
-        <w:spacing w:before="120" w:after="20"/>
+        <w:spacing w:before="60" w:after="20"/>
       </w:pPr>
-      <w:hyperlink r:id="rId22">
-        <w:r>
-          <w:rPr>
-            <w:rStyle w:val="Hyperlink"/>
-            <w:sz w:val="20"/>
-          </w:rPr>
-          <w:t>MentAI</w:t>
-        </w:r>
-      </w:hyperlink>
-    </w:p>
-    <w:p>
-      <w:pPr>
-        <w:spacing w:after="40"/>
-      </w:pPr>
-      <w:r>
-        <w:rPr>
-          <w:i/>
-          <w:color w:val="666666"/>
-        </w:rPr>
-        <w:t>AI Health Assistant, Web Application, Django, Python, Langchain, Multi-Agent AI, Javascript, HTMX, HTML/CSS, Tailwind</w:t>
-      </w:r>
-    </w:p>
-    <w:p>
-      <w:pPr>
-        <w:pStyle w:val="ListBullet"/>
-        <w:spacing w:after="20"/>
-      </w:pPr>
-      <w:hyperlink r:id="rId23">
-        <w:r>
-          <w:rPr>
-            <w:rStyle w:val="Hyperlink"/>
-            <w:sz w:val="20"/>
-          </w:rPr>
-          <w:t>Github Repo</w:t>
-        </w:r>
-      </w:hyperlink>
-    </w:p>
-    <w:p>
-      <w:pPr>
-        <w:spacing w:before="120" w:after="20"/>
-      </w:pPr>
-      <w:hyperlink r:id="rId24">
+      <w:hyperlink r:id="rId25">
         <w:r>
           <w:rPr>
             <w:rStyle w:val="Hyperlink"/>
@@ -612,48 +642,69 @@
     </w:p>
     <w:p>
       <w:pPr>
-        <w:spacing w:after="40"/>
+        <w:spacing w:after="20"/>
+      </w:pPr>
+      <w:r>
+        <w:rPr>
+          <w:b w:val="0"/>
+          <w:i w:val="0"/>
+        </w:rPr>
+        <w:t>AI president installation exhibited at TSYP12: a Blender-built 3D character in Unity with a custom lip-sync and expression system, driven by a Python RAG backend over speech-to-text and text-to-speech.</w:t>
+      </w:r>
+    </w:p>
+    <w:p>
+      <w:pPr>
+        <w:spacing w:after="20"/>
       </w:pPr>
       <w:r>
         <w:rPr>
           <w:i/>
           <w:color w:val="666666"/>
         </w:rPr>
-        <w:t>3D Interactive, Artificial Intelligence, Unity, Python, C#, Blender, RAG, Langchain, Photoshop</w:t>
+        <w:t>Artificial Intelligence, Unity, C#, RAG, LangChain, Blender, Python, Photoshop</w:t>
       </w:r>
     </w:p>
     <w:p>
       <w:pPr>
-        <w:spacing w:before="120" w:after="20"/>
+        <w:spacing w:before="60" w:after="20"/>
       </w:pPr>
-      <w:hyperlink r:id="rId25">
+      <w:hyperlink r:id="rId26">
         <w:r>
           <w:rPr>
             <w:rStyle w:val="Hyperlink"/>
             <w:sz w:val="20"/>
           </w:rPr>
-          <w:t>Rental Property Manager</w:t>
+          <w:t>DQN From Scratch</w:t>
         </w:r>
       </w:hyperlink>
     </w:p>
     <w:p>
       <w:pPr>
-        <w:spacing w:after="40"/>
+        <w:spacing w:after="20"/>
+      </w:pPr>
+      <w:r>
+        <w:rPr>
+          <w:b w:val="0"/>
+          <w:i w:val="0"/>
+        </w:rPr>
+        <w:t>Deep Q-Network implemented from scratch in C on a custom Sokol game stack: hand-written forward pass and backprop, experience replay, target networks and a training curriculum, applied to Pong.</w:t>
+      </w:r>
+    </w:p>
+    <w:p>
+      <w:pPr>
+        <w:spacing w:after="20"/>
       </w:pPr>
       <w:r>
         <w:rPr>
           <w:i/>
           <w:color w:val="666666"/>
         </w:rPr>
-        <w:t>React Native, Expo, Typescript, Supabase, CI/CD, Mobile</w:t>
+        <w:t>Reinforcement Learning, C, Deep Q-Network, Neural Networks, Sokol</w:t>
       </w:r>
-    </w:p>
-    <w:p>
-      <w:pPr>
-        <w:pStyle w:val="ListBullet"/>
-        <w:spacing w:after="20"/>
-      </w:pPr>
-      <w:hyperlink r:id="rId26">
+      <w:r>
+        <w:t xml:space="preserve">  ·  </w:t>
+      </w:r>
+      <w:hyperlink r:id="rId27">
         <w:r>
           <w:rPr>
             <w:rStyle w:val="Hyperlink"/>
@@ -665,9 +716,9 @@
     </w:p>
     <w:p>
       <w:pPr>
-        <w:spacing w:before="120" w:after="20"/>
+        <w:spacing w:before="60" w:after="20"/>
       </w:pPr>
-      <w:hyperlink r:id="rId27">
+      <w:hyperlink r:id="rId28">
         <w:r>
           <w:rPr>
             <w:rStyle w:val="Hyperlink"/>
@@ -679,22 +730,31 @@
     </w:p>
     <w:p>
       <w:pPr>
-        <w:spacing w:after="40"/>
+        <w:spacing w:after="20"/>
+      </w:pPr>
+      <w:r>
+        <w:rPr>
+          <w:b w:val="0"/>
+          <w:i w:val="0"/>
+        </w:rPr>
+        <w:t>Commercial 2D action-adventure in Unity, developed with Novel Bomb as sole in-engine programmer and lead developer on a 4-person team.</w:t>
+      </w:r>
+    </w:p>
+    <w:p>
+      <w:pPr>
+        <w:spacing w:after="20"/>
       </w:pPr>
       <w:r>
         <w:rPr>
           <w:i/>
           <w:color w:val="666666"/>
         </w:rPr>
-        <w:t>2D Game, Unity, C#</w:t>
+        <w:t>Unity, C#, Commercial Game, 2D Game, Team Lead</w:t>
       </w:r>
-    </w:p>
-    <w:p>
-      <w:pPr>
-        <w:pStyle w:val="ListBullet"/>
-        <w:spacing w:after="20"/>
-      </w:pPr>
-      <w:hyperlink r:id="rId28">
+      <w:r>
+        <w:t xml:space="preserve">  ·  </w:t>
+      </w:r>
+      <w:hyperlink r:id="rId29">
         <w:r>
           <w:rPr>
             <w:rStyle w:val="Hyperlink"/>
@@ -703,13 +763,10 @@
           <w:t>Website</w:t>
         </w:r>
       </w:hyperlink>
-    </w:p>
-    <w:p>
-      <w:pPr>
-        <w:pStyle w:val="ListBullet"/>
-        <w:spacing w:after="20"/>
-      </w:pPr>
-      <w:hyperlink r:id="rId18">
+      <w:r>
+        <w:t xml:space="preserve">  ·  </w:t>
+      </w:r>
+      <w:hyperlink r:id="rId19">
         <w:r>
           <w:rPr>
             <w:rStyle w:val="Hyperlink"/>
@@ -721,36 +778,45 @@
     </w:p>
     <w:p>
       <w:pPr>
-        <w:spacing w:before="120" w:after="20"/>
+        <w:spacing w:before="60" w:after="20"/>
       </w:pPr>
-      <w:hyperlink r:id="rId29">
+      <w:hyperlink r:id="rId30">
         <w:r>
           <w:rPr>
             <w:rStyle w:val="Hyperlink"/>
             <w:sz w:val="20"/>
           </w:rPr>
-          <w:t>The Lost Hope</w:t>
+          <w:t>create-project</w:t>
         </w:r>
       </w:hyperlink>
     </w:p>
     <w:p>
       <w:pPr>
-        <w:spacing w:after="40"/>
+        <w:spacing w:after="20"/>
+      </w:pPr>
+      <w:r>
+        <w:rPr>
+          <w:b w:val="0"/>
+          <w:i w:val="0"/>
+        </w:rPr>
+        <w:t>CLI that scaffolds an opencode-first project with agent memory, context files and review workflow, the same workflow CredVault was built through.</w:t>
+      </w:r>
+    </w:p>
+    <w:p>
+      <w:pPr>
+        <w:spacing w:after="20"/>
       </w:pPr>
       <w:r>
         <w:rPr>
           <w:i/>
           <w:color w:val="666666"/>
         </w:rPr>
-        <w:t>2D Game, Monogame, C#</w:t>
+        <w:t>AI Agents, Developer Tooling, OpenCode, Node.js, CLI</w:t>
       </w:r>
-    </w:p>
-    <w:p>
-      <w:pPr>
-        <w:pStyle w:val="ListBullet"/>
-        <w:spacing w:after="20"/>
-      </w:pPr>
-      <w:hyperlink r:id="rId30">
+      <w:r>
+        <w:t xml:space="preserve">  ·  </w:t>
+      </w:r>
+      <w:hyperlink r:id="rId31">
         <w:r>
           <w:rPr>
             <w:rStyle w:val="Hyperlink"/>
@@ -762,22 +828,7 @@
     </w:p>
     <w:p>
       <w:pPr>
-        <w:pStyle w:val="ListBullet"/>
-        <w:spacing w:after="20"/>
-      </w:pPr>
-      <w:hyperlink r:id="rId31">
-        <w:r>
-          <w:rPr>
-            <w:rStyle w:val="Hyperlink"/>
-            <w:sz w:val="20"/>
-          </w:rPr>
-          <w:t>Youtube Devlog Series</w:t>
-        </w:r>
-      </w:hyperlink>
-    </w:p>
-    <w:p>
-      <w:pPr>
-        <w:spacing w:before="280" w:after="80"/>
+        <w:spacing w:before="160" w:after="80"/>
         <w:pBdr>
           <w:bottom w:val="single" w:sz="6" w:space="4" w:color="444444"/>
         </w:pBdr>
@@ -793,7 +844,7 @@
     </w:p>
     <w:p>
       <w:pPr>
-        <w:spacing w:before="120" w:after="20"/>
+        <w:spacing w:before="60" w:after="20"/>
       </w:pPr>
       <w:r>
         <w:rPr>
@@ -823,13 +874,12 @@
           <w:b w:val="0"/>
           <w:i w:val="0"/>
         </w:rPr>
-        <w:t>Founded CSJAM, a 24-hour game jam challenging developers to build complete games from scratch. Led event organization, designed brand identity, and partnered with Tek-up IEEE Student Branch to execute the competition.</w:t>
+        <w:t>Founded CSJAM, a 24-hour game jam with 50 participants, organized with the Tek-up IEEE Student Branch.</w:t>
       </w:r>
     </w:p>
     <w:p>
       <w:pPr>
-        <w:pStyle w:val="ListBullet"/>
-        <w:spacing w:after="20"/>
+        <w:spacing w:after="40"/>
       </w:pPr>
       <w:hyperlink r:id="rId32">
         <w:r>
@@ -843,13 +893,13 @@
     </w:p>
     <w:p>
       <w:pPr>
-        <w:spacing w:before="120" w:after="20"/>
+        <w:spacing w:before="60" w:after="20"/>
       </w:pPr>
       <w:r>
         <w:rPr>
           <w:b/>
         </w:rPr>
-        <w:t>IEEE Member</w:t>
+        <w:t>IEEE Tek-up Student Branch, Computer Society Webmaster</w:t>
       </w:r>
     </w:p>
     <w:p>
@@ -873,47 +923,12 @@
           <w:b w:val="0"/>
           <w:i w:val="0"/>
         </w:rPr>
-        <w:t>Active member of the Tek-up IEEE Student Branch, participating in technical workshops, competitions and events.</w:t>
+        <w:t>Maintained the chapter website and social media, and joined technical workshops and competitions.</w:t>
       </w:r>
     </w:p>
     <w:p>
       <w:pPr>
-        <w:spacing w:before="120" w:after="20"/>
-      </w:pPr>
-      <w:r>
-        <w:rPr>
-          <w:b/>
-        </w:rPr>
-        <w:t>IEEE CS Chapter Webmaster</w:t>
-      </w:r>
-    </w:p>
-    <w:p>
-      <w:pPr>
-        <w:spacing w:after="40"/>
-      </w:pPr>
-      <w:r>
-        <w:rPr>
-          <w:i/>
-          <w:color w:val="666666"/>
-        </w:rPr>
-        <w:t>2023 - 2025</w:t>
-      </w:r>
-    </w:p>
-    <w:p>
-      <w:pPr>
-        <w:spacing w:after="60"/>
-      </w:pPr>
-      <w:r>
-        <w:rPr>
-          <w:b w:val="0"/>
-          <w:i w:val="0"/>
-        </w:rPr>
-        <w:t>Managed and maintained the Tek-up IEEE Student Branch Computer Society chapter website and social medias, handling content updates, technical maintenance, and digital communications.</w:t>
-      </w:r>
-    </w:p>
-    <w:p>
-      <w:pPr>
-        <w:spacing w:before="280" w:after="80"/>
+        <w:spacing w:before="160" w:after="80"/>
         <w:pBdr>
           <w:bottom w:val="single" w:sz="6" w:space="4" w:color="444444"/>
         </w:pBdr>
@@ -938,7 +953,7 @@
         <w:t xml:space="preserve">Programming Languages: </w:t>
       </w:r>
       <w:r>
-        <w:t>C#, C, Assembly, Python, Java, Javascript, Typescript, HTML/CSS, Dart, SQL</w:t>
+        <w:t>C#, C, Python, Rust, TypeScript, JavaScript, SQL</w:t>
       </w:r>
     </w:p>
     <w:p>
@@ -952,7 +967,7 @@
         <w:t xml:space="preserve">Game Development: </w:t>
       </w:r>
       <w:r>
-        <w:t>Unity, Godot, Monogame, Raylib, Sokol</w:t>
+        <w:t>Unity, Godot, MonoGame, Raylib, Sokol, SDL2, ECS</w:t>
       </w:r>
     </w:p>
     <w:p>
@@ -966,7 +981,7 @@
         <w:t xml:space="preserve">Web Development: </w:t>
       </w:r>
       <w:r>
-        <w:t>ASP.NET, Django, Flask, Angular, React, Nextjs</w:t>
+        <w:t>ASP.NET, Django, Flask, Angular, React, Next.js, HTMX, Tailwind, Supabase, Tauri, HTML/CSS</w:t>
       </w:r>
     </w:p>
     <w:p>
@@ -980,7 +995,7 @@
         <w:t xml:space="preserve">Mobile Development: </w:t>
       </w:r>
       <w:r>
-        <w:t>Flutter, React Native, Expo</w:t>
+        <w:t>React Native, Expo</w:t>
       </w:r>
     </w:p>
     <w:p>
@@ -994,7 +1009,7 @@
         <w:t xml:space="preserve">Machine Learning: </w:t>
       </w:r>
       <w:r>
-        <w:t>PyTorch, TensorFlow, Scikit-learn, Langchain, NLP</w:t>
+        <w:t>PyTorch, LangChain, NLP, RAG, Multi-Agent AI, BERT</w:t>
       </w:r>
     </w:p>
     <w:p>
@@ -1008,7 +1023,7 @@
         <w:t xml:space="preserve">Data &amp; Analytics: </w:t>
       </w:r>
       <w:r>
-        <w:t>Pandas, NumPy, Power BI, Row-Level Security</w:t>
+        <w:t>Pandas, NumPy, Power BI, Row-Level Security, Data Visualization</w:t>
       </w:r>
     </w:p>
     <w:p>
@@ -1022,12 +1037,26 @@
         <w:t xml:space="preserve">Tools &amp; DevOps: </w:t>
       </w:r>
       <w:r>
-        <w:t>Git, GitHub, Docker, Linux, Blender, REST APIs, CI/CD, Netlify, Render, Photoshop, Figma</w:t>
+        <w:t>Git, GitHub, Docker, Linux, REST APIs, CI/CD, Netlify</w:t>
+      </w:r>
+    </w:p>
+    <w:p>
+      <w:pPr>
+        <w:spacing w:after="60"/>
+      </w:pPr>
+      <w:r>
+        <w:rPr>
+          <w:b/>
+        </w:rPr>
+        <w:t xml:space="preserve">Spoken Languages: </w:t>
+      </w:r>
+      <w:r>
+        <w:t>Arabic (Native), French (Fluent), English (Fluent)</w:t>
       </w:r>
     </w:p>
     <w:sectPr>
       <w:pgSz w:w="12240" w:h="15840"/>
-      <w:pgMar w:top="1080" w:right="1296" w:bottom="1080" w:left="1296" w:header="720" w:footer="720" w:gutter="0"/>
+      <w:pgMar w:top="864" w:right="1152" w:bottom="864" w:left="1152" w:header="720" w:footer="720" w:gutter="0"/>
       <w:cols w:space="720"/>
       <w:docGrid w:linePitch="360"/>
     </w:sectPr>

</xml_diff>

<commit_message>
fix: update CV education status
</commit_message>
<xml_diff>
--- a/assets/files/Amen_Allah_Ben_Aissa_CV.docx
+++ b/assets/files/Amen_Allah_Ben_Aissa_CV.docx
@@ -448,7 +448,7 @@
           <w:i/>
           <w:color w:val="666666"/>
         </w:rPr>
-        <w:t>2023 - 2026</w:t>
+        <w:t>2023 - Present</w:t>
       </w:r>
     </w:p>
     <w:p>
@@ -460,7 +460,7 @@
           <w:b w:val="0"/>
           <w:i w:val="0"/>
         </w:rPr>
-        <w:t>Final-year Data Science engineering student focused on machine learning, statistical analysis and software engineering. Currently working on my end-of-studies project (PFE).</w:t>
+        <w:t>Final-year Data Science engineering student focused on machine learning, statistical analysis and software engineering. Currently seeking an end-of-studies internship (PFE) starting January 2027.</w:t>
       </w:r>
     </w:p>
     <w:p>

</xml_diff>